<commit_message>
Adiciona versão PDF dos cartões CRC e nome do integrante
- Gera docs/Cartoes-CRC.pdf a partir do .docx
- Ajusta layout dos cartões (sem quebra entre páginas, coluna de colaborações mais larga)
- Atualiza link no README
</commit_message>
<xml_diff>
--- a/docs/Cartoes-CRC.docx
+++ b/docs/Cartoes-CRC.docx
@@ -87,27 +87,7 @@
         <w:jc w:val="right"/>
       </w:pPr>
       <w:r>
-        <w:t>Nome Completo do Integrante 1</w:t>
-      </w:r>
-      <w:r>
-        <w:br/>
-        <w:t>Nome Completo do Integrante 2</w:t>
-      </w:r>
-      <w:r>
-        <w:br/>
-        <w:t>Nome Completo do Integrante 3</w:t>
-      </w:r>
-      <w:r>
-        <w:br/>
-        <w:t>Nome Completo do Integrante 4</w:t>
-      </w:r>
-    </w:p>
-    <w:p>
-      <w:pPr>
-        <w:jc w:val="right"/>
-      </w:pPr>
-      <w:r>
-        <w:t>Nome Completo do Integrante 5</w:t>
+        <w:t>Arthur Augusto Domingos Silva</w:t>
       </w:r>
     </w:p>
     <w:p>
@@ -287,11 +267,12 @@
         <w:tblLook w:val="0600" w:firstRow="0" w:lastRow="0" w:firstColumn="0" w:lastColumn="0" w:noHBand="1" w:noVBand="1"/>
       </w:tblPr>
       <w:tblGrid>
-        <w:gridCol w:w="5775"/>
-        <w:gridCol w:w="1785"/>
+        <w:gridCol w:w="5260"/>
+        <w:gridCol w:w="2300"/>
       </w:tblGrid>
       <w:tr>
         <w:trPr>
+          <w:cantSplit/>
           <w:trHeight w:val="400"/>
         </w:trPr>
         <w:tc>
@@ -307,6 +288,7 @@
           </w:tcPr>
           <w:p>
             <w:pPr>
+              <w:keepNext/>
               <w:widowControl w:val="0"/>
               <w:pBdr>
                 <w:top w:val="nil"/>
@@ -334,9 +316,12 @@
         </w:tc>
       </w:tr>
       <w:tr>
+        <w:trPr>
+          <w:cantSplit/>
+        </w:trPr>
         <w:tc>
           <w:tcPr>
-            <w:tcW w:w="5775" w:type="dxa"/>
+            <w:tcW w:w="5260" w:type="dxa"/>
             <w:tcMar>
               <w:top w:w="100" w:type="dxa"/>
               <w:left w:w="100" w:type="dxa"/>
@@ -346,6 +331,7 @@
           </w:tcPr>
           <w:p>
             <w:pPr>
+              <w:keepNext/>
               <w:widowControl w:val="0"/>
               <w:pBdr>
                 <w:top w:val="nil"/>
@@ -373,7 +359,7 @@
         </w:tc>
         <w:tc>
           <w:tcPr>
-            <w:tcW w:w="1785" w:type="dxa"/>
+            <w:tcW w:w="2300" w:type="dxa"/>
             <w:tcMar>
               <w:top w:w="100" w:type="dxa"/>
               <w:left w:w="100" w:type="dxa"/>
@@ -383,6 +369,7 @@
           </w:tcPr>
           <w:p>
             <w:pPr>
+              <w:keepNext/>
               <w:widowControl w:val="0"/>
               <w:pBdr>
                 <w:top w:val="nil"/>
@@ -410,9 +397,12 @@
         </w:tc>
       </w:tr>
       <w:tr>
+        <w:trPr>
+          <w:cantSplit/>
+        </w:trPr>
         <w:tc>
           <w:tcPr>
-            <w:tcW w:w="5775" w:type="dxa"/>
+            <w:tcW w:w="5260" w:type="dxa"/>
             <w:tcMar>
               <w:top w:w="100" w:type="dxa"/>
               <w:left w:w="100" w:type="dxa"/>
@@ -465,7 +455,7 @@
         </w:tc>
         <w:tc>
           <w:tcPr>
-            <w:tcW w:w="1785" w:type="dxa"/>
+            <w:tcW w:w="2300" w:type="dxa"/>
             <w:tcMar>
               <w:top w:w="100" w:type="dxa"/>
               <w:left w:w="100" w:type="dxa"/>
@@ -509,11 +499,12 @@
         <w:tblLook w:val="0600" w:firstRow="0" w:lastRow="0" w:firstColumn="0" w:lastColumn="0" w:noHBand="1" w:noVBand="1"/>
       </w:tblPr>
       <w:tblGrid>
-        <w:gridCol w:w="5775"/>
-        <w:gridCol w:w="1785"/>
+        <w:gridCol w:w="5260"/>
+        <w:gridCol w:w="2300"/>
       </w:tblGrid>
       <w:tr>
         <w:trPr>
+          <w:cantSplit/>
           <w:trHeight w:val="400"/>
         </w:trPr>
         <w:tc>
@@ -529,6 +520,7 @@
           </w:tcPr>
           <w:p>
             <w:pPr>
+              <w:keepNext/>
               <w:widowControl w:val="0"/>
               <w:pBdr>
                 <w:top w:val="nil"/>
@@ -556,9 +548,12 @@
         </w:tc>
       </w:tr>
       <w:tr>
+        <w:trPr>
+          <w:cantSplit/>
+        </w:trPr>
         <w:tc>
           <w:tcPr>
-            <w:tcW w:w="5775" w:type="dxa"/>
+            <w:tcW w:w="5260" w:type="dxa"/>
             <w:tcMar>
               <w:top w:w="100" w:type="dxa"/>
               <w:left w:w="100" w:type="dxa"/>
@@ -568,6 +563,7 @@
           </w:tcPr>
           <w:p>
             <w:pPr>
+              <w:keepNext/>
               <w:widowControl w:val="0"/>
               <w:pBdr>
                 <w:top w:val="nil"/>
@@ -595,7 +591,7 @@
         </w:tc>
         <w:tc>
           <w:tcPr>
-            <w:tcW w:w="1785" w:type="dxa"/>
+            <w:tcW w:w="2300" w:type="dxa"/>
             <w:tcMar>
               <w:top w:w="100" w:type="dxa"/>
               <w:left w:w="100" w:type="dxa"/>
@@ -605,6 +601,7 @@
           </w:tcPr>
           <w:p>
             <w:pPr>
+              <w:keepNext/>
               <w:widowControl w:val="0"/>
               <w:pBdr>
                 <w:top w:val="nil"/>
@@ -632,9 +629,12 @@
         </w:tc>
       </w:tr>
       <w:tr>
+        <w:trPr>
+          <w:cantSplit/>
+        </w:trPr>
         <w:tc>
           <w:tcPr>
-            <w:tcW w:w="5775" w:type="dxa"/>
+            <w:tcW w:w="5260" w:type="dxa"/>
             <w:tcMar>
               <w:top w:w="100" w:type="dxa"/>
               <w:left w:w="100" w:type="dxa"/>
@@ -715,7 +715,7 @@
         </w:tc>
         <w:tc>
           <w:tcPr>
-            <w:tcW w:w="1785" w:type="dxa"/>
+            <w:tcW w:w="2300" w:type="dxa"/>
             <w:tcMar>
               <w:top w:w="100" w:type="dxa"/>
               <w:left w:w="100" w:type="dxa"/>
@@ -803,11 +803,12 @@
         <w:tblLook w:val="0600" w:firstRow="0" w:lastRow="0" w:firstColumn="0" w:lastColumn="0" w:noHBand="1" w:noVBand="1"/>
       </w:tblPr>
       <w:tblGrid>
-        <w:gridCol w:w="5775"/>
-        <w:gridCol w:w="1785"/>
+        <w:gridCol w:w="5260"/>
+        <w:gridCol w:w="2300"/>
       </w:tblGrid>
       <w:tr>
         <w:trPr>
+          <w:cantSplit/>
           <w:trHeight w:val="400"/>
         </w:trPr>
         <w:tc>
@@ -823,6 +824,7 @@
           </w:tcPr>
           <w:p>
             <w:pPr>
+              <w:keepNext/>
               <w:widowControl w:val="0"/>
               <w:pBdr>
                 <w:top w:val="nil"/>
@@ -850,9 +852,12 @@
         </w:tc>
       </w:tr>
       <w:tr>
+        <w:trPr>
+          <w:cantSplit/>
+        </w:trPr>
         <w:tc>
           <w:tcPr>
-            <w:tcW w:w="5775" w:type="dxa"/>
+            <w:tcW w:w="5260" w:type="dxa"/>
             <w:tcMar>
               <w:top w:w="100" w:type="dxa"/>
               <w:left w:w="100" w:type="dxa"/>
@@ -862,6 +867,7 @@
           </w:tcPr>
           <w:p>
             <w:pPr>
+              <w:keepNext/>
               <w:widowControl w:val="0"/>
               <w:pBdr>
                 <w:top w:val="nil"/>
@@ -889,7 +895,7 @@
         </w:tc>
         <w:tc>
           <w:tcPr>
-            <w:tcW w:w="1785" w:type="dxa"/>
+            <w:tcW w:w="2300" w:type="dxa"/>
             <w:tcMar>
               <w:top w:w="100" w:type="dxa"/>
               <w:left w:w="100" w:type="dxa"/>
@@ -899,6 +905,7 @@
           </w:tcPr>
           <w:p>
             <w:pPr>
+              <w:keepNext/>
               <w:widowControl w:val="0"/>
               <w:pBdr>
                 <w:top w:val="nil"/>
@@ -926,9 +933,12 @@
         </w:tc>
       </w:tr>
       <w:tr>
+        <w:trPr>
+          <w:cantSplit/>
+        </w:trPr>
         <w:tc>
           <w:tcPr>
-            <w:tcW w:w="5775" w:type="dxa"/>
+            <w:tcW w:w="5260" w:type="dxa"/>
             <w:tcMar>
               <w:top w:w="100" w:type="dxa"/>
               <w:left w:w="100" w:type="dxa"/>
@@ -981,7 +991,7 @@
         </w:tc>
         <w:tc>
           <w:tcPr>
-            <w:tcW w:w="1785" w:type="dxa"/>
+            <w:tcW w:w="2300" w:type="dxa"/>
             <w:tcMar>
               <w:top w:w="100" w:type="dxa"/>
               <w:left w:w="100" w:type="dxa"/>
@@ -1037,11 +1047,12 @@
         <w:tblLook w:val="0600" w:firstRow="0" w:lastRow="0" w:firstColumn="0" w:lastColumn="0" w:noHBand="1" w:noVBand="1"/>
       </w:tblPr>
       <w:tblGrid>
-        <w:gridCol w:w="5775"/>
-        <w:gridCol w:w="1785"/>
+        <w:gridCol w:w="5260"/>
+        <w:gridCol w:w="2300"/>
       </w:tblGrid>
       <w:tr>
         <w:trPr>
+          <w:cantSplit/>
           <w:trHeight w:val="400"/>
         </w:trPr>
         <w:tc>
@@ -1057,6 +1068,7 @@
           </w:tcPr>
           <w:p>
             <w:pPr>
+              <w:keepNext/>
               <w:widowControl w:val="0"/>
               <w:pBdr>
                 <w:top w:val="nil"/>
@@ -1084,9 +1096,12 @@
         </w:tc>
       </w:tr>
       <w:tr>
+        <w:trPr>
+          <w:cantSplit/>
+        </w:trPr>
         <w:tc>
           <w:tcPr>
-            <w:tcW w:w="5775" w:type="dxa"/>
+            <w:tcW w:w="5260" w:type="dxa"/>
             <w:tcMar>
               <w:top w:w="100" w:type="dxa"/>
               <w:left w:w="100" w:type="dxa"/>
@@ -1096,6 +1111,7 @@
           </w:tcPr>
           <w:p>
             <w:pPr>
+              <w:keepNext/>
               <w:widowControl w:val="0"/>
               <w:pBdr>
                 <w:top w:val="nil"/>
@@ -1123,7 +1139,7 @@
         </w:tc>
         <w:tc>
           <w:tcPr>
-            <w:tcW w:w="1785" w:type="dxa"/>
+            <w:tcW w:w="2300" w:type="dxa"/>
             <w:tcMar>
               <w:top w:w="100" w:type="dxa"/>
               <w:left w:w="100" w:type="dxa"/>
@@ -1133,6 +1149,7 @@
           </w:tcPr>
           <w:p>
             <w:pPr>
+              <w:keepNext/>
               <w:widowControl w:val="0"/>
               <w:pBdr>
                 <w:top w:val="nil"/>
@@ -1160,9 +1177,12 @@
         </w:tc>
       </w:tr>
       <w:tr>
+        <w:trPr>
+          <w:cantSplit/>
+        </w:trPr>
         <w:tc>
           <w:tcPr>
-            <w:tcW w:w="5775" w:type="dxa"/>
+            <w:tcW w:w="5260" w:type="dxa"/>
             <w:tcMar>
               <w:top w:w="100" w:type="dxa"/>
               <w:left w:w="100" w:type="dxa"/>
@@ -1243,7 +1263,7 @@
         </w:tc>
         <w:tc>
           <w:tcPr>
-            <w:tcW w:w="1785" w:type="dxa"/>
+            <w:tcW w:w="2300" w:type="dxa"/>
             <w:tcMar>
               <w:top w:w="100" w:type="dxa"/>
               <w:left w:w="100" w:type="dxa"/>
@@ -1332,11 +1352,12 @@
         <w:tblLook w:val="0600" w:firstRow="0" w:lastRow="0" w:firstColumn="0" w:lastColumn="0" w:noHBand="1" w:noVBand="1"/>
       </w:tblPr>
       <w:tblGrid>
-        <w:gridCol w:w="5775"/>
-        <w:gridCol w:w="1785"/>
+        <w:gridCol w:w="5260"/>
+        <w:gridCol w:w="2300"/>
       </w:tblGrid>
       <w:tr>
         <w:trPr>
+          <w:cantSplit/>
           <w:trHeight w:val="400"/>
         </w:trPr>
         <w:tc>
@@ -1352,6 +1373,7 @@
           </w:tcPr>
           <w:p>
             <w:pPr>
+              <w:keepNext/>
               <w:widowControl w:val="0"/>
               <w:pBdr>
                 <w:top w:val="nil"/>
@@ -1379,9 +1401,12 @@
         </w:tc>
       </w:tr>
       <w:tr>
+        <w:trPr>
+          <w:cantSplit/>
+        </w:trPr>
         <w:tc>
           <w:tcPr>
-            <w:tcW w:w="5775" w:type="dxa"/>
+            <w:tcW w:w="5260" w:type="dxa"/>
             <w:tcMar>
               <w:top w:w="100" w:type="dxa"/>
               <w:left w:w="100" w:type="dxa"/>
@@ -1391,6 +1416,7 @@
           </w:tcPr>
           <w:p>
             <w:pPr>
+              <w:keepNext/>
               <w:widowControl w:val="0"/>
               <w:pBdr>
                 <w:top w:val="nil"/>
@@ -1418,7 +1444,7 @@
         </w:tc>
         <w:tc>
           <w:tcPr>
-            <w:tcW w:w="1785" w:type="dxa"/>
+            <w:tcW w:w="2300" w:type="dxa"/>
             <w:tcMar>
               <w:top w:w="100" w:type="dxa"/>
               <w:left w:w="100" w:type="dxa"/>
@@ -1428,6 +1454,7 @@
           </w:tcPr>
           <w:p>
             <w:pPr>
+              <w:keepNext/>
               <w:widowControl w:val="0"/>
               <w:pBdr>
                 <w:top w:val="nil"/>
@@ -1455,9 +1482,12 @@
         </w:tc>
       </w:tr>
       <w:tr>
+        <w:trPr>
+          <w:cantSplit/>
+        </w:trPr>
         <w:tc>
           <w:tcPr>
-            <w:tcW w:w="5775" w:type="dxa"/>
+            <w:tcW w:w="5260" w:type="dxa"/>
             <w:tcMar>
               <w:top w:w="100" w:type="dxa"/>
               <w:left w:w="100" w:type="dxa"/>
@@ -1538,7 +1568,7 @@
         </w:tc>
         <w:tc>
           <w:tcPr>
-            <w:tcW w:w="1785" w:type="dxa"/>
+            <w:tcW w:w="2300" w:type="dxa"/>
             <w:tcMar>
               <w:top w:w="100" w:type="dxa"/>
               <w:left w:w="100" w:type="dxa"/>
@@ -1593,11 +1623,12 @@
         <w:tblLook w:val="0600" w:firstRow="0" w:lastRow="0" w:firstColumn="0" w:lastColumn="0" w:noHBand="1" w:noVBand="1"/>
       </w:tblPr>
       <w:tblGrid>
-        <w:gridCol w:w="5775"/>
-        <w:gridCol w:w="1785"/>
+        <w:gridCol w:w="5260"/>
+        <w:gridCol w:w="2300"/>
       </w:tblGrid>
       <w:tr>
         <w:trPr>
+          <w:cantSplit/>
           <w:trHeight w:val="400"/>
         </w:trPr>
         <w:tc>
@@ -1613,6 +1644,7 @@
           </w:tcPr>
           <w:p>
             <w:pPr>
+              <w:keepNext/>
               <w:widowControl w:val="0"/>
               <w:pBdr>
                 <w:top w:val="nil"/>
@@ -1640,9 +1672,12 @@
         </w:tc>
       </w:tr>
       <w:tr>
+        <w:trPr>
+          <w:cantSplit/>
+        </w:trPr>
         <w:tc>
           <w:tcPr>
-            <w:tcW w:w="5775" w:type="dxa"/>
+            <w:tcW w:w="5260" w:type="dxa"/>
             <w:tcMar>
               <w:top w:w="100" w:type="dxa"/>
               <w:left w:w="100" w:type="dxa"/>
@@ -1652,6 +1687,7 @@
           </w:tcPr>
           <w:p>
             <w:pPr>
+              <w:keepNext/>
               <w:widowControl w:val="0"/>
               <w:pBdr>
                 <w:top w:val="nil"/>
@@ -1679,7 +1715,7 @@
         </w:tc>
         <w:tc>
           <w:tcPr>
-            <w:tcW w:w="1785" w:type="dxa"/>
+            <w:tcW w:w="2300" w:type="dxa"/>
             <w:tcMar>
               <w:top w:w="100" w:type="dxa"/>
               <w:left w:w="100" w:type="dxa"/>
@@ -1689,6 +1725,7 @@
           </w:tcPr>
           <w:p>
             <w:pPr>
+              <w:keepNext/>
               <w:widowControl w:val="0"/>
               <w:pBdr>
                 <w:top w:val="nil"/>
@@ -1716,9 +1753,12 @@
         </w:tc>
       </w:tr>
       <w:tr>
+        <w:trPr>
+          <w:cantSplit/>
+        </w:trPr>
         <w:tc>
           <w:tcPr>
-            <w:tcW w:w="5775" w:type="dxa"/>
+            <w:tcW w:w="5260" w:type="dxa"/>
             <w:tcMar>
               <w:top w:w="100" w:type="dxa"/>
               <w:left w:w="100" w:type="dxa"/>
@@ -1813,7 +1853,7 @@
         </w:tc>
         <w:tc>
           <w:tcPr>
-            <w:tcW w:w="1785" w:type="dxa"/>
+            <w:tcW w:w="2300" w:type="dxa"/>
             <w:tcMar>
               <w:top w:w="100" w:type="dxa"/>
               <w:left w:w="100" w:type="dxa"/>
@@ -1913,11 +1953,12 @@
         <w:tblLook w:val="0600" w:firstRow="0" w:lastRow="0" w:firstColumn="0" w:lastColumn="0" w:noHBand="1" w:noVBand="1"/>
       </w:tblPr>
       <w:tblGrid>
-        <w:gridCol w:w="5775"/>
-        <w:gridCol w:w="1785"/>
+        <w:gridCol w:w="5260"/>
+        <w:gridCol w:w="2300"/>
       </w:tblGrid>
       <w:tr>
         <w:trPr>
+          <w:cantSplit/>
           <w:trHeight w:val="400"/>
         </w:trPr>
         <w:tc>
@@ -1933,6 +1974,7 @@
           </w:tcPr>
           <w:p>
             <w:pPr>
+              <w:keepNext/>
               <w:widowControl w:val="0"/>
               <w:pBdr>
                 <w:top w:val="nil"/>
@@ -1960,9 +2002,12 @@
         </w:tc>
       </w:tr>
       <w:tr>
+        <w:trPr>
+          <w:cantSplit/>
+        </w:trPr>
         <w:tc>
           <w:tcPr>
-            <w:tcW w:w="5775" w:type="dxa"/>
+            <w:tcW w:w="5260" w:type="dxa"/>
             <w:tcMar>
               <w:top w:w="100" w:type="dxa"/>
               <w:left w:w="100" w:type="dxa"/>
@@ -1972,6 +2017,7 @@
           </w:tcPr>
           <w:p>
             <w:pPr>
+              <w:keepNext/>
               <w:widowControl w:val="0"/>
               <w:pBdr>
                 <w:top w:val="nil"/>
@@ -1999,7 +2045,7 @@
         </w:tc>
         <w:tc>
           <w:tcPr>
-            <w:tcW w:w="1785" w:type="dxa"/>
+            <w:tcW w:w="2300" w:type="dxa"/>
             <w:tcMar>
               <w:top w:w="100" w:type="dxa"/>
               <w:left w:w="100" w:type="dxa"/>
@@ -2009,6 +2055,7 @@
           </w:tcPr>
           <w:p>
             <w:pPr>
+              <w:keepNext/>
               <w:widowControl w:val="0"/>
               <w:pBdr>
                 <w:top w:val="nil"/>
@@ -2036,9 +2083,12 @@
         </w:tc>
       </w:tr>
       <w:tr>
+        <w:trPr>
+          <w:cantSplit/>
+        </w:trPr>
         <w:tc>
           <w:tcPr>
-            <w:tcW w:w="5775" w:type="dxa"/>
+            <w:tcW w:w="5260" w:type="dxa"/>
             <w:tcMar>
               <w:top w:w="100" w:type="dxa"/>
               <w:left w:w="100" w:type="dxa"/>
@@ -2161,7 +2211,7 @@
         </w:tc>
         <w:tc>
           <w:tcPr>
-            <w:tcW w:w="1785" w:type="dxa"/>
+            <w:tcW w:w="2300" w:type="dxa"/>
             <w:tcMar>
               <w:top w:w="100" w:type="dxa"/>
               <w:left w:w="100" w:type="dxa"/>
@@ -2261,11 +2311,12 @@
         <w:tblLook w:val="0600" w:firstRow="0" w:lastRow="0" w:firstColumn="0" w:lastColumn="0" w:noHBand="1" w:noVBand="1"/>
       </w:tblPr>
       <w:tblGrid>
-        <w:gridCol w:w="5775"/>
-        <w:gridCol w:w="1785"/>
+        <w:gridCol w:w="5260"/>
+        <w:gridCol w:w="2300"/>
       </w:tblGrid>
       <w:tr>
         <w:trPr>
+          <w:cantSplit/>
           <w:trHeight w:val="400"/>
         </w:trPr>
         <w:tc>
@@ -2281,6 +2332,7 @@
           </w:tcPr>
           <w:p>
             <w:pPr>
+              <w:keepNext/>
               <w:widowControl w:val="0"/>
               <w:pBdr>
                 <w:top w:val="nil"/>
@@ -2308,9 +2360,12 @@
         </w:tc>
       </w:tr>
       <w:tr>
+        <w:trPr>
+          <w:cantSplit/>
+        </w:trPr>
         <w:tc>
           <w:tcPr>
-            <w:tcW w:w="5775" w:type="dxa"/>
+            <w:tcW w:w="5260" w:type="dxa"/>
             <w:tcMar>
               <w:top w:w="100" w:type="dxa"/>
               <w:left w:w="100" w:type="dxa"/>
@@ -2320,6 +2375,7 @@
           </w:tcPr>
           <w:p>
             <w:pPr>
+              <w:keepNext/>
               <w:widowControl w:val="0"/>
               <w:pBdr>
                 <w:top w:val="nil"/>
@@ -2347,7 +2403,7 @@
         </w:tc>
         <w:tc>
           <w:tcPr>
-            <w:tcW w:w="1785" w:type="dxa"/>
+            <w:tcW w:w="2300" w:type="dxa"/>
             <w:tcMar>
               <w:top w:w="100" w:type="dxa"/>
               <w:left w:w="100" w:type="dxa"/>
@@ -2357,6 +2413,7 @@
           </w:tcPr>
           <w:p>
             <w:pPr>
+              <w:keepNext/>
               <w:widowControl w:val="0"/>
               <w:pBdr>
                 <w:top w:val="nil"/>
@@ -2384,9 +2441,12 @@
         </w:tc>
       </w:tr>
       <w:tr>
+        <w:trPr>
+          <w:cantSplit/>
+        </w:trPr>
         <w:tc>
           <w:tcPr>
-            <w:tcW w:w="5775" w:type="dxa"/>
+            <w:tcW w:w="5260" w:type="dxa"/>
             <w:tcMar>
               <w:top w:w="100" w:type="dxa"/>
               <w:left w:w="100" w:type="dxa"/>
@@ -2509,7 +2569,7 @@
         </w:tc>
         <w:tc>
           <w:tcPr>
-            <w:tcW w:w="1785" w:type="dxa"/>
+            <w:tcW w:w="2300" w:type="dxa"/>
             <w:tcMar>
               <w:top w:w="100" w:type="dxa"/>
               <w:left w:w="100" w:type="dxa"/>
@@ -2576,11 +2636,12 @@
         <w:tblLook w:val="0600" w:firstRow="0" w:lastRow="0" w:firstColumn="0" w:lastColumn="0" w:noHBand="1" w:noVBand="1"/>
       </w:tblPr>
       <w:tblGrid>
-        <w:gridCol w:w="5775"/>
-        <w:gridCol w:w="1785"/>
+        <w:gridCol w:w="5260"/>
+        <w:gridCol w:w="2300"/>
       </w:tblGrid>
       <w:tr>
         <w:trPr>
+          <w:cantSplit/>
           <w:trHeight w:val="400"/>
         </w:trPr>
         <w:tc>
@@ -2596,6 +2657,7 @@
           </w:tcPr>
           <w:p>
             <w:pPr>
+              <w:keepNext/>
               <w:widowControl w:val="0"/>
               <w:pBdr>
                 <w:top w:val="nil"/>
@@ -2623,9 +2685,12 @@
         </w:tc>
       </w:tr>
       <w:tr>
+        <w:trPr>
+          <w:cantSplit/>
+        </w:trPr>
         <w:tc>
           <w:tcPr>
-            <w:tcW w:w="5775" w:type="dxa"/>
+            <w:tcW w:w="5260" w:type="dxa"/>
             <w:tcMar>
               <w:top w:w="100" w:type="dxa"/>
               <w:left w:w="100" w:type="dxa"/>
@@ -2635,6 +2700,7 @@
           </w:tcPr>
           <w:p>
             <w:pPr>
+              <w:keepNext/>
               <w:widowControl w:val="0"/>
               <w:pBdr>
                 <w:top w:val="nil"/>
@@ -2662,7 +2728,7 @@
         </w:tc>
         <w:tc>
           <w:tcPr>
-            <w:tcW w:w="1785" w:type="dxa"/>
+            <w:tcW w:w="2300" w:type="dxa"/>
             <w:tcMar>
               <w:top w:w="100" w:type="dxa"/>
               <w:left w:w="100" w:type="dxa"/>
@@ -2672,6 +2738,7 @@
           </w:tcPr>
           <w:p>
             <w:pPr>
+              <w:keepNext/>
               <w:widowControl w:val="0"/>
               <w:pBdr>
                 <w:top w:val="nil"/>
@@ -2699,9 +2766,12 @@
         </w:tc>
       </w:tr>
       <w:tr>
+        <w:trPr>
+          <w:cantSplit/>
+        </w:trPr>
         <w:tc>
           <w:tcPr>
-            <w:tcW w:w="5775" w:type="dxa"/>
+            <w:tcW w:w="5260" w:type="dxa"/>
             <w:tcMar>
               <w:top w:w="100" w:type="dxa"/>
               <w:left w:w="100" w:type="dxa"/>
@@ -2796,7 +2866,7 @@
         </w:tc>
         <w:tc>
           <w:tcPr>
-            <w:tcW w:w="1785" w:type="dxa"/>
+            <w:tcW w:w="2300" w:type="dxa"/>
             <w:tcMar>
               <w:top w:w="100" w:type="dxa"/>
               <w:left w:w="100" w:type="dxa"/>

</xml_diff>